<commit_message>
Split installation into download, Gatekeeper, and menu bar steps.
The menu bar step also recommends hiding the system battery icon.

Co-authored-by: Cursor <cursoragent@cursor.com>
</commit_message>
<xml_diff>
--- a/how2install.docx
+++ b/how2install.docx
@@ -29,17 +29,6 @@
     </w:p>
     <w:p>
       <w:pPr>
-        <w:spacing w:after="160"/>
-      </w:pPr>
-      <w:r>
-        <w:rPr>
-          <w:rFonts w:ascii="Arial" w:eastAsia="Arial" w:hAnsi="Arial"/>
-        </w:rPr>
-        <w:t xml:space="preserve">The disk image is not notarized by Apple. I do not have an Apple Developer account, which costs 99 USD a year, so macOS blocks the first launch. This is not a virus. MacPower is open source. The code is in the repository, and a virus in it would be visible there.</w:t>
-      </w:r>
-    </w:p>
-    <w:p>
-      <w:pPr>
         <w:pStyle w:val="Heading2"/>
         <w:spacing w:after="120" w:before="280"/>
       </w:pPr>
@@ -49,17 +38,12 @@
           <w:b/>
           <w:bCs/>
         </w:rPr>
-        <w:t xml:space="preserve">Disk image</w:t>
-      </w:r>
-    </w:p>
-    <w:p>
-      <w:pPr>
-        <w:pStyle w:val="ListParagraph"/>
-        <w:numPr>
-          <w:ilvl w:val="0"/>
-          <w:numId w:val="2"/>
-        </w:numPr>
-        <w:spacing w:after="80"/>
+        <w:t xml:space="preserve">Step 1: Download and install</w:t>
+      </w:r>
+    </w:p>
+    <w:p>
+      <w:pPr>
+        <w:spacing w:after="160"/>
       </w:pPr>
       <w:r>
         <w:rPr>
@@ -70,12 +54,66 @@
     </w:p>
     <w:p>
       <w:pPr>
-        <w:pStyle w:val="ListParagraph"/>
-        <w:numPr>
-          <w:ilvl w:val="0"/>
-          <w:numId w:val="2"/>
-        </w:numPr>
-        <w:spacing w:after="80"/>
+        <w:spacing w:after="160"/>
+      </w:pPr>
+      <w:r>
+        <w:rPr>
+          <w:rFonts w:ascii="Arial" w:eastAsia="Arial" w:hAnsi="Arial"/>
+        </w:rPr>
+        <w:t xml:space="preserve">You can skip the disk image and run this in Terminal instead:</w:t>
+      </w:r>
+    </w:p>
+    <w:p>
+      <w:pPr>
+        <w:shd w:fill="F5F5F7" w:val="clear"/>
+        <w:spacing w:after="160" w:before="80"/>
+      </w:pPr>
+      <w:r>
+        <w:rPr>
+          <w:rFonts w:ascii="Menlo" w:eastAsia="Menlo" w:hAnsi="Menlo"/>
+        </w:rPr>
+        <w:t xml:space="preserve">brew install --cask --no-quarantine ryanstarfox/tap/macpower</w:t>
+      </w:r>
+    </w:p>
+    <w:p>
+      <w:pPr>
+        <w:spacing w:after="160"/>
+      </w:pPr>
+      <w:r>
+        <w:rPr>
+          <w:rFonts w:ascii="Arial" w:eastAsia="Arial" w:hAnsi="Arial"/>
+        </w:rPr>
+        <w:t xml:space="preserve">--no-quarantine is required. Official homebrew/cask does not accept this kind of package, so the command uses a personal tap. This command usually skips the block in step 2. Step 3 still applies.</w:t>
+      </w:r>
+    </w:p>
+    <w:p>
+      <w:pPr>
+        <w:pStyle w:val="Heading2"/>
+        <w:spacing w:after="120" w:before="280"/>
+      </w:pPr>
+      <w:r>
+        <w:rPr>
+          <w:rFonts w:ascii="Arial" w:eastAsia="Arial" w:hAnsi="Arial"/>
+          <w:b/>
+          <w:bCs/>
+        </w:rPr>
+        <w:t xml:space="preserve">Step 2: If macOS blocks the app</w:t>
+      </w:r>
+    </w:p>
+    <w:p>
+      <w:pPr>
+        <w:spacing w:after="160"/>
+      </w:pPr>
+      <w:r>
+        <w:rPr>
+          <w:rFonts w:ascii="Arial" w:eastAsia="Arial" w:hAnsi="Arial"/>
+        </w:rPr>
+        <w:t xml:space="preserve">The disk image is not notarized by Apple. I do not have an Apple Developer account, which costs 99 USD a year, so macOS blocks the first launch. This is not a virus. MacPower is open source. The code is in the repository, and a virus in it would be visible there.</w:t>
+      </w:r>
+    </w:p>
+    <w:p>
+      <w:pPr>
+        <w:spacing w:after="160"/>
       </w:pPr>
       <w:r>
         <w:rPr>
@@ -131,34 +169,13 @@
     </w:p>
     <w:p>
       <w:pPr>
-        <w:pStyle w:val="ListParagraph"/>
-        <w:numPr>
-          <w:ilvl w:val="0"/>
-          <w:numId w:val="2"/>
-        </w:numPr>
-        <w:spacing w:after="80"/>
+        <w:spacing w:after="160"/>
       </w:pPr>
       <w:r>
         <w:rPr>
           <w:rFonts w:ascii="Arial" w:eastAsia="Arial" w:hAnsi="Arial"/>
         </w:rPr>
         <w:t xml:space="preserve">Then allow it with method 1. Use method 2 if method 1 does not work.</w:t>
-      </w:r>
-    </w:p>
-    <w:p>
-      <w:pPr>
-        <w:pStyle w:val="ListParagraph"/>
-        <w:numPr>
-          <w:ilvl w:val="0"/>
-          <w:numId w:val="2"/>
-        </w:numPr>
-        <w:spacing w:after="80"/>
-      </w:pPr>
-      <w:r>
-        <w:rPr>
-          <w:rFonts w:ascii="Arial" w:eastAsia="Arial" w:hAnsi="Arial"/>
-        </w:rPr>
-        <w:t xml:space="preserve">Open System Settings → Menu Bar, allow MacPower to appear in the menu bar, then launch it from Applications.</w:t>
       </w:r>
     </w:p>
     <w:p>
@@ -279,7 +296,7 @@
           <w:b/>
           <w:bCs/>
         </w:rPr>
-        <w:t xml:space="preserve">Homebrew</w:t>
+        <w:t xml:space="preserve">Step 3: Show it in the menu bar</w:t>
       </w:r>
     </w:p>
     <w:p>
@@ -290,30 +307,39 @@
         <w:rPr>
           <w:rFonts w:ascii="Arial" w:eastAsia="Arial" w:hAnsi="Arial"/>
         </w:rPr>
-        <w:t xml:space="preserve">You can skip the disk image and run this in Terminal instead:</w:t>
-      </w:r>
-    </w:p>
-    <w:p>
-      <w:pPr>
-        <w:shd w:fill="F5F5F7" w:val="clear"/>
-        <w:spacing w:after="160" w:before="80"/>
-      </w:pPr>
-      <w:r>
-        <w:rPr>
-          <w:rFonts w:ascii="Menlo" w:eastAsia="Menlo" w:hAnsi="Menlo"/>
-        </w:rPr>
-        <w:t xml:space="preserve">brew install --cask --no-quarantine ryanstarfox/tap/macpower</w:t>
-      </w:r>
-    </w:p>
-    <w:p>
-      <w:pPr>
-        <w:spacing w:after="160"/>
-      </w:pPr>
-      <w:r>
-        <w:rPr>
-          <w:rFonts w:ascii="Arial" w:eastAsia="Arial" w:hAnsi="Arial"/>
-        </w:rPr>
-        <w:t xml:space="preserve">--no-quarantine is required. Official homebrew/cask does not accept this kind of package, so the command uses a personal tap.</w:t>
+        <w:t xml:space="preserve">Open System Settings → Menu Bar.</w:t>
+      </w:r>
+    </w:p>
+    <w:p>
+      <w:pPr>
+        <w:pStyle w:val="ListParagraph"/>
+        <w:numPr>
+          <w:ilvl w:val="0"/>
+          <w:numId w:val="2"/>
+        </w:numPr>
+        <w:spacing w:after="80"/>
+      </w:pPr>
+      <w:r>
+        <w:rPr>
+          <w:rFonts w:ascii="Arial" w:eastAsia="Arial" w:hAnsi="Arial"/>
+        </w:rPr>
+        <w:t xml:space="preserve">Allow MacPower to appear in the menu bar, then launch it from Applications.</w:t>
+      </w:r>
+    </w:p>
+    <w:p>
+      <w:pPr>
+        <w:pStyle w:val="ListParagraph"/>
+        <w:numPr>
+          <w:ilvl w:val="0"/>
+          <w:numId w:val="2"/>
+        </w:numPr>
+        <w:spacing w:after="80"/>
+      </w:pPr>
+      <w:r>
+        <w:rPr>
+          <w:rFonts w:ascii="Arial" w:eastAsia="Arial" w:hAnsi="Arial"/>
+        </w:rPr>
+        <w:t xml:space="preserve">Turning off the built-in Battery item is recommended, so the menu bar shows one battery icon. You can leave the system icon on.</w:t>
       </w:r>
     </w:p>
     <w:sectPr>
@@ -490,8 +516,8 @@
     <w:multiLevelType w:val="hybridMultilevel"/>
     <w:lvl w:ilvl="0" w:tentative="1">
       <w:start w:val="1"/>
-      <w:numFmt w:val="decimal"/>
-      <w:lvlText w:val="%1."/>
+      <w:numFmt w:val="bullet"/>
+      <w:lvlText w:val="•"/>
       <w:lvlJc w:val="left"/>
       <w:pPr>
         <w:ind w:left="720" w:hanging="360"/>

</xml_diff>